<commit_message>
feat: improve vision demo and local startup workflow
</commit_message>
<xml_diff>
--- a/doc/01.需求说明书/家健镜 HomeCare Twin 需求规格说明书-P0-V1.0.docx
+++ b/doc/01.需求说明书/家健镜 HomeCare Twin 需求规格说明书-P0-V1.0.docx
@@ -11345,35 +11345,7 @@
           <w:rFonts w:ascii="Consolas" w:eastAsia="等线" w:hAnsi="Consolas" w:hint="eastAsia"/>
           <w:sz w:val="18"/>
         </w:rPr>
-        <w:t>上传图片</w:t>
-      </w:r>
-      <w:r>
-        <w:rPr>
-          <w:rFonts w:ascii="Consolas" w:eastAsia="等线" w:hAnsi="Consolas" w:hint="eastAsia"/>
-          <w:sz w:val="18"/>
-        </w:rPr>
-        <w:t>/</w:t>
-      </w:r>
-      <w:r>
-        <w:rPr>
-          <w:rFonts w:ascii="Consolas" w:eastAsia="等线" w:hAnsi="Consolas" w:hint="eastAsia"/>
-          <w:sz w:val="18"/>
-        </w:rPr>
-        <w:t>短视频</w:t>
-      </w:r>
-      <w:r>
-        <w:rPr>
-          <w:rFonts w:ascii="Consolas" w:eastAsia="等线" w:hAnsi="Consolas" w:hint="eastAsia"/>
-          <w:sz w:val="18"/>
-        </w:rPr>
-        <w:t xml:space="preserve"> </w:t>
-      </w:r>
-      <w:r>
-        <w:rPr>
-          <w:rFonts w:ascii="Consolas" w:eastAsia="等线" w:hAnsi="Consolas" w:hint="eastAsia"/>
-          <w:sz w:val="18"/>
-        </w:rPr>
-        <w:t>→</w:t>
+        <w:t>上传图片→</w:t>
       </w:r>
       <w:r>
         <w:rPr>
@@ -30702,7 +30674,7 @@
             <w:rPr>
               <w:noProof/>
             </w:rPr>
-            <w:t>2026-8-13</w:t>
+            <w:t>2026-8-15</w:t>
           </w:r>
           <w:r>
             <w:fldChar w:fldCharType="end"/>

</xml_diff>